<commit_message>
sync(maestro): propagar marcador TEST a derivados
Co-authored-by: manuelmmontufarm-dev <manuelmmontufarm-dev@users.noreply.github.com>
</commit_message>
<xml_diff>
--- a/instructivos/finales/RECEPCION_DE_MADERA_guia_v2_ACTUALIZADO_2026-06-19.docx
+++ b/instructivos/finales/RECEPCION_DE_MADERA_guia_v2_ACTUALIZADO_2026-06-19.docx
@@ -5941,6 +5941,78 @@
     </w:p>
     <w:p>
       <w:pPr>
+        <w:p>
+          <w:pPr>
+            <w:pStyle w:val="Heading1"/>
+          </w:pPr>
+          <w:r>
+            <w:t xml:space="preserve">TEST</w:t>
+          </w:r>
+        </w:p>
+        <w:p>
+          <w:pPr>
+            <w:pStyle w:val="Normal"/>
+          </w:pPr>
+          <w:r>
+            <w:t xml:space="preserve">⚠️ MARCADOR DE PRUEBA DEL AGENT — Este texto debe aparecer al final de TODOS los documentos derivados:</w:t>
+          </w:r>
+        </w:p>
+        <w:p>
+          <w:pPr>
+            <w:pStyle w:val="Normal"/>
+          </w:pPr>
+          <w:r>
+            <w:t xml:space="preserve">Si ves la palabra TEST al final de cada uno de esos documentos, el agent de sincronización está funcionando correctamente. Este marcador se elimina después de validar el test.</w:t>
+          </w:r>
+        </w:p>
+        <w:p>
+          <w:pPr>
+            <w:pStyle w:val="Normal"/>
+          </w:pPr>
+          <w:r>
+            <w:t xml:space="preserve">TEST — 2026-06-19 12:25 (-05 ECT)</w:t>
+          </w:r>
+        </w:p>
+        <w:p>
+          <w:pPr>
+            <w:pStyle w:val="Normal"/>
+          </w:pPr>
+          <w:r>
+            <w:t xml:space="preserve">Este marcador fue añadido en la edición del 2026-06-19 a las 12:25 para verificar que el agent de sincronización propaga cambios reales del maestro a los 4 derivados. Si ves esta línea con el timestamp 2026-06-19 12:25 al final de los siguientes archivos, el sistema funciona:</w:t>
+          </w:r>
+        </w:p>
+        <w:p>
+          <w:pPr>
+            <w:pStyle w:val="Normal"/>
+          </w:pPr>
+          <w:r>
+            <w:t xml:space="preserve">• html-app/NOVOPNHTML1_files/Screens.jsx</w:t>
+          </w:r>
+        </w:p>
+        <w:p>
+          <w:pPr>
+            <w:pStyle w:val="Normal"/>
+          </w:pPr>
+          <w:r>
+            <w:t xml:space="preserve">• instructivos/finales/IJP_FINAL_ACTUALIZADO_2026-06-19.docx</w:t>
+          </w:r>
+        </w:p>
+        <w:p>
+          <w:pPr>
+            <w:pStyle w:val="Normal"/>
+          </w:pPr>
+          <w:r>
+            <w:t xml:space="preserve">• instructivos/finales/RECEPCION_DE_MADERA_guia_v2_ACTUALIZADO_2026-06-19.docx</w:t>
+          </w:r>
+        </w:p>
+        <w:p>
+          <w:pPr>
+            <w:pStyle w:val="Normal"/>
+          </w:pPr>
+          <w:r>
+            <w:t xml:space="preserve">• instructivos/finales/NOVOPAN_Guia_Recepcion_Madera_FINAL_ESTATICO.html</w:t>
+          </w:r>
+        </w:p>
         <w:pStyle w:val="Heading1"/>
       </w:pPr>
       <w:r>
@@ -5952,7 +6024,7 @@
         <w:pStyle w:val="Normal"/>
       </w:pPr>
       <w:r>
-        <w:t xml:space="preserve">Última actualización: 2026-06-19 09:53 (-05 ECT) — Editor: Manuel Montúfar</w:t>
+        <w:t xml:space="preserve">Última actualización: 2026-06-19 12:25 (-05 ECT) — Editor: Manuel Montúfar</w:t>
       </w:r>
     </w:p>
     <w:p>
@@ -5960,7 +6032,23 @@
         <w:pStyle w:val="Normal"/>
       </w:pPr>
       <w:r>
-        <w:t xml:space="preserve">Fuente única de verdad: docs-finales/CONTENIDO_MAESTRO.md</w:t>
+        <w:t xml:space="preserve">Fuente única de verdad: instructivos/finales/CONTENIDO_MAESTRO.md</w:t>
+      </w:r>
+    </w:p>
+    <w:p>
+      <w:pPr>
+        <w:pStyle w:val="Normal"/>
+      </w:pPr>
+      <w:r>
+        <w:t xml:space="preserve">2026-06-19 12:25 (-05 ECT) — Manuel Montúfar</w:t>
+      </w:r>
+    </w:p>
+    <w:p>
+      <w:pPr>
+        <w:pStyle w:val="Normal"/>
+      </w:pPr>
+      <w:r>
+        <w:t xml:space="preserve">Marcador TEST de sincronización propagado desde CONTENIDO_MAESTRO.md para verificar que cambios reales del maestro llegan a los documentos derivados.</w:t>
       </w:r>
     </w:p>
     <w:p>

</xml_diff>